<commit_message>
Update 10.2026: PMO-Assistent (Kernfunktionen)
- M34: Kontextdokumente auf Projekt Kompass umgestellt (Steuerkreis-Vorbereitung,
  Nachbereitung 28.04.2026), Skriptname extract_actions.py korrigiert
- M27 Template A: StatusberichtResult aus Tracker, Risikoliste und Entscheidungsprotokoll
- M38: PMO-Kernfunktion als Pflichtbestandteil; Leitaufgabe v2.3 mit Ergebnisformaten
- PMO-Begriff in M01, M34, M38, quick_template und README; Skill-Beispiele angepasst

Co-Authored-By: Claude Sonnet 5.5 <noreply@anthropic.com>
</commit_message>
<xml_diff>
--- a/02_daten/01_text/01_meeting_auftrag.docx
+++ b/02_daten/01_text/01_meeting_auftrag.docx
@@ -7,7 +7,7 @@
         <w:pStyle w:val="Heading1"/>
       </w:pPr>
       <w:r>
-        <w:t>Meeting-Auftrag: Sprint-Review M35 DeepAgents</w:t>
+        <w:t>Meeting-Auftrag: Nächster Steuerkreis Projekt Kompass</w:t>
       </w:r>
     </w:p>
     <w:p>
@@ -20,17 +20,17 @@
     </w:p>
     <w:p>
       <w:r>
-        <w:t>Das interne Sprint-Review dient der Vorbereitung einer Demo zum Meeting-Briefing-Skill auf Basis von DeepAgents.</w:t>
+        <w:t>Der Steuerkreis vom 19.05.2026 hat die Entscheidung über die Reichweite der Rechte- und Rollensteuerung vertagt. Der nächste Steuerkreis dient der Vorbereitung dieser Entscheidung.</w:t>
       </w:r>
     </w:p>
     <w:p>
       <w:r>
-        <w:t>Im Fokus steht nicht eine allgemeine Framework-Einfuehrung, sondern die konkrete Frage, wie ein wiederverwendbarer Skill mit mehreren Kontextdokumenten, festen Regeln und deterministischer Action-Item-Extraktion umgesetzt werden kann.</w:t>
+        <w:t>Mara Vogt benötigt dafür ein Briefing, das den aktuellen Stand, die aktiven Entscheidungen, die offenen Punkte und die Risiken in einer Übersicht zusammenfasst.</w:t>
       </w:r>
     </w:p>
     <w:p>
       <w:r>
-        <w:t>Das Briefing soll fuer eine interne Review-Runde erstellt werden, in der Produkt, Engineering, QA und Training gemeinsam bewerten, ob das Beispiel didaktisch tragfaehig ist.</w:t>
+        <w:t>Das Briefing enthält nur belegbare Aussagen. Fehlende Angaben sind als [offen] markiert.</w:t>
       </w:r>
     </w:p>
     <w:p>
@@ -48,22 +48,22 @@
     </w:p>
     <w:p>
       <w:r>
-        <w:t>Datum/Zeit: 2026-03-27, 10:00 bis 10:30 Uhr</w:t>
+        <w:t>Datum/Zeit: [offen] (nach dem 20.05.2026)</w:t>
       </w:r>
     </w:p>
     <w:p>
       <w:r>
-        <w:t>Ort: Remote via Teams</w:t>
+        <w:t>Ort: [offen]</w:t>
       </w:r>
     </w:p>
     <w:p>
       <w:r>
-        <w:t>Teilnehmer: Lea Hoffmann (Produkt), Murat Yilmaz (Engineering), Sophie Keller (Training), Jonas Weber (QA), Klara Stein (Moderation)</w:t>
+        <w:t>Teilnehmer laut Stakeholder-Rollenliste: Mara Vogt (Projektleitung), Jonas Reiter (IT-Architektur), Dr. Thomas Brandt (Datenschutz/Compliance), Elif Kaya (Fachbereich Vertrieb), Sabine Holler (Sponsorin)</w:t>
       </w:r>
     </w:p>
     <w:p>
       <w:r>
-        <w:t>Geplante Dauer: 30 Minuten</w:t>
+        <w:t>Geplante Dauer: [offen]</w:t>
       </w:r>
     </w:p>
     <w:p>
@@ -76,45 +76,12 @@
     </w:p>
     <w:p>
       <w:r>
-        <w:t>Am Ende des Meetings soll ein belastbares Meeting-Briefing vorliegen, das direkt in der Demo verwendet werden kann.</w:t>
+        <w:t>Ziel am Ende des Meetings: Klarheit über die weiterzuverfolgende technische Option für die Rechte- und Rollensteuerung im Prototyp oder über die dafür fehlenden Informationen.</w:t>
       </w:r>
     </w:p>
     <w:p>
       <w:r>
-        <w:t>Die Agenda soll priorisiert, realistisch getaktet und auf maximal 30 Minuten begrenzt sein.</w:t>
-      </w:r>
-    </w:p>
-    <w:p>
-      <w:r>
-        <w:t>Offene Risiken sollen explizit benoetigt und nicht implizit uebersprungen werden.</w:t>
-      </w:r>
-    </w:p>
-    <w:p>
-      <w:r>
-        <w:t>Zusaetzlich soll entschieden werden, ob das Muster spaeter auch fuer Meeting-Nachbereitungen wiederverwendet wird.</w:t>
-      </w:r>
-    </w:p>
-    <w:p>
-      <w:pPr>
-        <w:pStyle w:val="Heading2"/>
-      </w:pPr>
-      <w:r>
-        <w:t>Kontext fuer die Review-Runde</w:t>
-      </w:r>
-    </w:p>
-    <w:p>
-      <w:r>
-        <w:t>In den vorherigen Modulen wurde bereits mit Skills, Guardrails und DeepAgents gearbeitet. Die aktuelle Demo soll diese Themen zusammenfuehren.</w:t>
-      </w:r>
-    </w:p>
-    <w:p>
-      <w:r>
-        <w:t>Die Review-Runde erwartet kein Produktivsystem, sondern ein didaktisch sauberes Beispiel mit nachvollziehbarer Tool-Nutzung.</w:t>
-      </w:r>
-    </w:p>
-    <w:p>
-      <w:r>
-        <w:t>Besonders wichtig ist, dass die Trennung zwischen Skill-Regeln, Tool-Logik und DeepAgents-Harness sichtbar bleibt.</w:t>
+        <w:t>Das Briefing nennt ausdrücklich, dass die Rechte- und Rollensteuerung bisher diskutiert, aber nicht beschlossen wurde.</w:t>
       </w:r>
     </w:p>
     <w:p>
@@ -127,27 +94,27 @@
     </w:p>
     <w:p>
       <w:r>
-        <w:t>1. Ziel und Scope der Demo bestaetigen.</w:t>
+        <w:t>1. Stand seit dem Steuerkreis vom 19.05.2026.</w:t>
       </w:r>
     </w:p>
     <w:p>
       <w:r>
-        <w:t>2. Blocker und Risiken fuer den Demo-Run benennen.</w:t>
+        <w:t>2. Rechte- und Rollensteuerung: technische Optionen und Mindestanforderungen an den Datenschutz.</w:t>
       </w:r>
     </w:p>
     <w:p>
       <w:r>
-        <w:t>3. Action Items aus den vorhandenen Unterlagen abgleichen.</w:t>
+        <w:t>3. Stand von Risiko R2 (Datenschutzfreigabe): mitigiert für den kuratierten Korpus.</w:t>
       </w:r>
     </w:p>
     <w:p>
       <w:r>
-        <w:t>4. Offene Fragen fuer die Moderation sammeln.</w:t>
+        <w:t>4. Offene Aufgaben aus dem Follow-up-Tracker.</w:t>
       </w:r>
     </w:p>
     <w:p>
       <w:r>
-        <w:t>5. Naechste Schritte bis zum eigentlichen Review festhalten.</w:t>
+        <w:t>5. Nächste Schritte festhalten.</w:t>
       </w:r>
     </w:p>
     <w:p>
@@ -160,17 +127,17 @@
     </w:p>
     <w:p>
       <w:r>
-        <w:t>Soll der Demo-Fokus ausschliesslich auf Vorbereitung liegen oder auch die Nachbereitung bereits angedeutet werden?</w:t>
+        <w:t>Welcher der drei Ansätze (Filterung beim Dokumentzugriff, Filterung während der Retrieval-Abfrage oder nachträgliche Prüfung der Antwortquellen) ist für den Prototyp realistisch?</w:t>
       </w:r>
     </w:p>
     <w:p>
       <w:r>
-        <w:t>Reicht ein einzelner Writer-Sub-Agent aus, oder wird mittelfristig ein Judge-Schritt benoetigt?</w:t>
+        <w:t>Reicht die Prototypfreigabe für produktive Daten aus, oder ist dafür eine separate Prüfung erforderlich?</w:t>
       </w:r>
     </w:p>
     <w:p>
       <w:r>
-        <w:t>Wer uebernimmt in der eigentlichen Session die Moderation, falls Klara kurzfristig ausfaellt?</w:t>
+        <w:t>Wann findet der nächste Steuerkreis statt?</w:t>
       </w:r>
     </w:p>
     <w:p>
@@ -183,17 +150,17 @@
     </w:p>
     <w:p>
       <w:r>
-        <w:t>Wenn zu viele Dokumente ungefiltert in den Kontext laufen, kann die Latenz des Agenten deutlich steigen.</w:t>
+        <w:t>Eine nachträgliche Filterung der Antwortquellen allein ist als Sicherheitsmaßnahme nicht ausreichend, weil vertrauliche Inhalte dann bereits im Kontext des Modells gelandet sein können.</w:t>
       </w:r>
     </w:p>
     <w:p>
       <w:r>
-        <w:t>Falls das Tool-Calling fuer extract_actions im Notebook nicht sichtbar ist, koennte die Demo wie reine Prompt-Magie wirken.</w:t>
+        <w:t>Risiko R2 gilt als mitigiert, ist aber nicht erledigt. Es bleibt beobachtet, weil sich der Datenumfang im Projekt ändern kann.</w:t>
       </w:r>
     </w:p>
     <w:p>
       <w:r>
-        <w:t>Wenn Rollen und Verantwortlichkeiten in den Unterlagen uneinheitlich formuliert sind, steigt das Risiko fuer unklare Action Items.</w:t>
+        <w:t>Zu den Risiken R1, R3 und R4 liegt nur die Risikoliste vom 17.03.2026 vor. Ein aktueller Status ist in den Protokollen nicht belegt.</w:t>
       </w:r>
     </w:p>
     <w:p>
@@ -206,27 +173,17 @@
     </w:p>
     <w:p>
       <w:r>
-        <w:t>Lea Hoffmann uebernimmt die Demo-Story fuer das interne Review bis 2026-03-25.</w:t>
+        <w:t>Mara Vogt klärt die Entscheidung zur Rechte- und Rollensteuerung (vertagt, offen).</w:t>
       </w:r>
     </w:p>
     <w:p>
       <w:r>
-        <w:t>Murat Yilmaz erstellt eine Laufzeit-Einschaetzung fuer den DeepAgents-Run bis 2026-03-26.</w:t>
+        <w:t>Jonas Reiter soll bis zum nächsten Termin zwei technische Optionen für die Zugriffssteuerung skizzieren.</w:t>
       </w:r>
     </w:p>
     <w:p>
       <w:r>
-        <w:t>Sophie Keller bereitet eine kurze didaktische Einordnung fuer die Review-Runde bis 2026-03-26 vor.</w:t>
-      </w:r>
-    </w:p>
-    <w:p>
-      <w:r>
-        <w:t>Jonas Weber prueft einen no_context-Testfall bis naechste Woche.</w:t>
-      </w:r>
-    </w:p>
-    <w:p>
-      <w:r>
-        <w:t>Klara Stein finalisiert einen Vorschlag fuer die Moderation bis 2026-03-26.</w:t>
+        <w:t>Dr. Thomas Brandt soll Mindestanforderungen für datenschutzkonforme Dokumentzugriffe im späteren Betrieb formulieren.</w:t>
       </w:r>
     </w:p>
     <w:sectPr>

</xml_diff>